<commit_message>
Updated UI and Final Models
</commit_message>
<xml_diff>
--- a/REPORT of EDA.docx
+++ b/REPORT of EDA.docx
@@ -969,7 +969,7 @@
     <w:p>
       <w:r>
         <w:pict w14:anchorId="2DA569DC">
-          <v:rect id="_x0000_i1043" style="width:0;height:1.5pt" o:hralign="center" o:hrstd="t" o:hr="t" fillcolor="#a0a0a0" stroked="f"/>
+          <v:rect id="_x0000_i1025" style="width:0;height:1.5pt" o:hralign="center" o:hrstd="t" o:hr="t" fillcolor="#a0a0a0" stroked="f"/>
         </w:pict>
       </w:r>
     </w:p>
@@ -1051,7 +1051,7 @@
     <w:p>
       <w:r>
         <w:pict w14:anchorId="3DDADCC3">
-          <v:rect id="_x0000_i1044" style="width:0;height:1.5pt" o:hralign="center" o:hrstd="t" o:hr="t" fillcolor="#a0a0a0" stroked="f"/>
+          <v:rect id="_x0000_i1026" style="width:0;height:1.5pt" o:hralign="center" o:hrstd="t" o:hr="t" fillcolor="#a0a0a0" stroked="f"/>
         </w:pict>
       </w:r>
     </w:p>
@@ -1137,7 +1137,7 @@
     <w:p>
       <w:r>
         <w:pict w14:anchorId="10540C65">
-          <v:rect id="_x0000_i1045" style="width:0;height:1.5pt" o:hralign="center" o:hrstd="t" o:hr="t" fillcolor="#a0a0a0" stroked="f"/>
+          <v:rect id="_x0000_i1027" style="width:0;height:1.5pt" o:hralign="center" o:hrstd="t" o:hr="t" fillcolor="#a0a0a0" stroked="f"/>
         </w:pict>
       </w:r>
     </w:p>
@@ -1209,6 +1209,247 @@
         <w:t>Ye judge ko dikhane layak graph hai.</w:t>
       </w:r>
     </w:p>
+    <w:tbl>
+      <w:tblPr>
+        <w:tblW w:w="0" w:type="auto"/>
+        <w:tblCellSpacing w:w="15" w:type="dxa"/>
+        <w:tblCellMar>
+          <w:top w:w="15" w:type="dxa"/>
+          <w:left w:w="15" w:type="dxa"/>
+          <w:bottom w:w="15" w:type="dxa"/>
+          <w:right w:w="15" w:type="dxa"/>
+        </w:tblCellMar>
+        <w:tblLook w:val="04A0" w:firstRow="1" w:lastRow="0" w:firstColumn="1" w:lastColumn="0" w:noHBand="0" w:noVBand="1"/>
+      </w:tblPr>
+      <w:tblGrid>
+        <w:gridCol w:w="1740"/>
+        <w:gridCol w:w="1588"/>
+      </w:tblGrid>
+      <w:tr>
+        <w:trPr>
+          <w:tblHeader/>
+          <w:tblCellSpacing w:w="15" w:type="dxa"/>
+        </w:trPr>
+        <w:tc>
+          <w:tcPr>
+            <w:tcW w:w="0" w:type="auto"/>
+            <w:vAlign w:val="center"/>
+            <w:hideMark/>
+          </w:tcPr>
+          <w:p>
+            <w:pPr>
+              <w:rPr>
+                <w:b/>
+                <w:bCs/>
+              </w:rPr>
+            </w:pPr>
+            <w:r>
+              <w:rPr>
+                <w:b/>
+                <w:bCs/>
+              </w:rPr>
+              <w:t>Target</w:t>
+            </w:r>
+          </w:p>
+        </w:tc>
+        <w:tc>
+          <w:tcPr>
+            <w:tcW w:w="0" w:type="auto"/>
+            <w:vAlign w:val="center"/>
+            <w:hideMark/>
+          </w:tcPr>
+          <w:p>
+            <w:pPr>
+              <w:rPr>
+                <w:b/>
+                <w:bCs/>
+              </w:rPr>
+            </w:pPr>
+            <w:r>
+              <w:rPr>
+                <w:b/>
+                <w:bCs/>
+              </w:rPr>
+              <w:t>Final Model</w:t>
+            </w:r>
+          </w:p>
+        </w:tc>
+      </w:tr>
+      <w:tr>
+        <w:trPr>
+          <w:tblCellSpacing w:w="15" w:type="dxa"/>
+        </w:trPr>
+        <w:tc>
+          <w:tcPr>
+            <w:tcW w:w="0" w:type="auto"/>
+            <w:vAlign w:val="center"/>
+            <w:hideMark/>
+          </w:tcPr>
+          <w:p>
+            <w:r>
+              <w:t>CompressorHealth</w:t>
+            </w:r>
+          </w:p>
+        </w:tc>
+        <w:tc>
+          <w:tcPr>
+            <w:tcW w:w="0" w:type="auto"/>
+            <w:vAlign w:val="center"/>
+            <w:hideMark/>
+          </w:tcPr>
+          <w:p>
+            <w:r>
+              <w:t>Extra Trees</w:t>
+            </w:r>
+          </w:p>
+        </w:tc>
+      </w:tr>
+      <w:tr>
+        <w:trPr>
+          <w:tblCellSpacing w:w="15" w:type="dxa"/>
+        </w:trPr>
+        <w:tc>
+          <w:tcPr>
+            <w:tcW w:w="0" w:type="auto"/>
+            <w:vAlign w:val="center"/>
+            <w:hideMark/>
+          </w:tcPr>
+          <w:p>
+            <w:r>
+              <w:t>CombustorHealth</w:t>
+            </w:r>
+          </w:p>
+        </w:tc>
+        <w:tc>
+          <w:tcPr>
+            <w:tcW w:w="0" w:type="auto"/>
+            <w:vAlign w:val="center"/>
+            <w:hideMark/>
+          </w:tcPr>
+          <w:p>
+            <w:r>
+              <w:t>Extra Trees</w:t>
+            </w:r>
+          </w:p>
+        </w:tc>
+      </w:tr>
+      <w:tr>
+        <w:trPr>
+          <w:tblCellSpacing w:w="15" w:type="dxa"/>
+        </w:trPr>
+        <w:tc>
+          <w:tcPr>
+            <w:tcW w:w="0" w:type="auto"/>
+            <w:vAlign w:val="center"/>
+            <w:hideMark/>
+          </w:tcPr>
+          <w:p>
+            <w:r>
+              <w:t>TurbineHealth</w:t>
+            </w:r>
+          </w:p>
+        </w:tc>
+        <w:tc>
+          <w:tcPr>
+            <w:tcW w:w="0" w:type="auto"/>
+            <w:vAlign w:val="center"/>
+            <w:hideMark/>
+          </w:tcPr>
+          <w:p>
+            <w:r>
+              <w:t>Ridge Regression</w:t>
+            </w:r>
+          </w:p>
+        </w:tc>
+      </w:tr>
+      <w:tr>
+        <w:trPr>
+          <w:tblCellSpacing w:w="15" w:type="dxa"/>
+        </w:trPr>
+        <w:tc>
+          <w:tcPr>
+            <w:tcW w:w="0" w:type="auto"/>
+            <w:vAlign w:val="center"/>
+            <w:hideMark/>
+          </w:tcPr>
+          <w:p>
+            <w:r>
+              <w:t>OverallHealth</w:t>
+            </w:r>
+          </w:p>
+        </w:tc>
+        <w:tc>
+          <w:tcPr>
+            <w:tcW w:w="0" w:type="auto"/>
+            <w:vAlign w:val="center"/>
+            <w:hideMark/>
+          </w:tcPr>
+          <w:p>
+            <w:r>
+              <w:t>Extra Trees</w:t>
+            </w:r>
+          </w:p>
+        </w:tc>
+      </w:tr>
+      <w:tr>
+        <w:trPr>
+          <w:tblCellSpacing w:w="15" w:type="dxa"/>
+        </w:trPr>
+        <w:tc>
+          <w:tcPr>
+            <w:tcW w:w="0" w:type="auto"/>
+            <w:vAlign w:val="center"/>
+            <w:hideMark/>
+          </w:tcPr>
+          <w:p>
+            <w:r>
+              <w:t>Thrust</w:t>
+            </w:r>
+          </w:p>
+        </w:tc>
+        <w:tc>
+          <w:tcPr>
+            <w:tcW w:w="0" w:type="auto"/>
+            <w:vAlign w:val="center"/>
+            <w:hideMark/>
+          </w:tcPr>
+          <w:p>
+            <w:r>
+              <w:t>CatBoost</w:t>
+            </w:r>
+          </w:p>
+        </w:tc>
+      </w:tr>
+      <w:tr>
+        <w:trPr>
+          <w:tblCellSpacing w:w="15" w:type="dxa"/>
+        </w:trPr>
+        <w:tc>
+          <w:tcPr>
+            <w:tcW w:w="0" w:type="auto"/>
+            <w:vAlign w:val="center"/>
+            <w:hideMark/>
+          </w:tcPr>
+          <w:p>
+            <w:r>
+              <w:t>TSFC</w:t>
+            </w:r>
+          </w:p>
+        </w:tc>
+        <w:tc>
+          <w:tcPr>
+            <w:tcW w:w="0" w:type="auto"/>
+            <w:vAlign w:val="center"/>
+            <w:hideMark/>
+          </w:tcPr>
+          <w:p>
+            <w:r>
+              <w:t>CatBoost</w:t>
+            </w:r>
+          </w:p>
+        </w:tc>
+      </w:tr>
+    </w:tbl>
     <w:p>
       <w:pPr>
         <w:rPr>

</xml_diff>